<commit_message>
Update official donation ledger with 13th donor Sri Dina Bandhu Das (Goalpara - ₹10,000, Total ₹26,101) & update README.md
</commit_message>
<xml_diff>
--- a/Documents/Donation list of members.docx
+++ b/Documents/Donation list of members.docx
@@ -2691,6 +2691,863 @@
                 <w:lang w:bidi="ar"/>
               </w:rPr>
               <w:t>012</w:t>
+            </w:r>
+          </w:p>
+        </w:tc>
+      </w:tr>
+      <w:tr>
+        <w:tc>
+          <w:tcPr>
+            <w:tcW w:w="656" w:type="dxa"/>
+            <w:shd w:val="clear" w:color="auto" w:fill="auto"/>
+            <w:vAlign w:val="center"/>
+          </w:tcPr>
+          <w:p>
+            <w:pPr>
+              <w:widowControl w:val="0"/>
+              <w:jc w:val="both"/>
+              <w:rPr>
+                <w:rFonts w:ascii="SimSun" w:eastAsia="SimSun" w:hAnsi="SimSun" w:cs="SimSun"/>
+                <w:b/>
+                <w:bCs/>
+                <w:sz w:val="24"/>
+                <w:szCs w:val="24"/>
+                <w:lang w:bidi="ar"/>
+              </w:rPr>
+            </w:pPr>
+            <w:r>
+              <w:rPr>
+                <w:rFonts w:ascii="SimSun" w:eastAsia="SimSun" w:hAnsi="SimSun" w:cs="SimSun"/>
+                <w:b/>
+                <w:bCs/>
+                <w:sz w:val="24"/>
+                <w:szCs w:val="24"/>
+                <w:lang w:bidi="ar"/>
+              </w:rPr>
+              <w:t>11</w:t>
+            </w:r>
+          </w:p>
+        </w:tc>
+        <w:tc>
+          <w:tcPr>
+            <w:tcW w:w="2447" w:type="dxa"/>
+            <w:shd w:val="clear" w:color="auto" w:fill="auto"/>
+            <w:vAlign w:val="center"/>
+          </w:tcPr>
+          <w:p>
+            <w:pPr>
+              <w:widowControl w:val="0"/>
+              <w:jc w:val="both"/>
+              <w:rPr>
+                <w:rFonts w:ascii="SimSun" w:eastAsia="SimSun" w:hAnsi="SimSun" w:cs="SimSun"/>
+                <w:b/>
+                <w:bCs/>
+                <w:sz w:val="24"/>
+                <w:szCs w:val="24"/>
+                <w:lang w:bidi="ar"/>
+              </w:rPr>
+            </w:pPr>
+            <w:proofErr w:type="spellStart"/>
+            <w:r>
+              <w:rPr>
+                <w:rFonts w:ascii="SimSun" w:eastAsia="SimSun" w:hAnsi="SimSun" w:cs="SimSun"/>
+                <w:b/>
+                <w:bCs/>
+                <w:sz w:val="24"/>
+                <w:szCs w:val="24"/>
+                <w:lang w:bidi="ar"/>
+              </w:rPr>
+              <w:t>Laisram</w:t>
+            </w:r>
+            <w:proofErr w:type="spellEnd"/>
+            <w:r>
+              <w:rPr>
+                <w:rFonts w:ascii="SimSun" w:eastAsia="SimSun" w:hAnsi="SimSun" w:cs="SimSun"/>
+                <w:b/>
+                <w:bCs/>
+                <w:sz w:val="24"/>
+                <w:szCs w:val="24"/>
+                <w:lang w:bidi="ar"/>
+              </w:rPr>
+              <w:t xml:space="preserve"> </w:t>
+            </w:r>
+            <w:proofErr w:type="spellStart"/>
+            <w:r>
+              <w:rPr>
+                <w:rFonts w:ascii="SimSun" w:eastAsia="SimSun" w:hAnsi="SimSun" w:cs="SimSun"/>
+                <w:b/>
+                <w:bCs/>
+                <w:sz w:val="24"/>
+                <w:szCs w:val="24"/>
+                <w:lang w:bidi="ar"/>
+              </w:rPr>
+              <w:t>Pankaj</w:t>
+            </w:r>
+            <w:proofErr w:type="spellEnd"/>
+            <w:r>
+              <w:rPr>
+                <w:rFonts w:ascii="SimSun" w:eastAsia="SimSun" w:hAnsi="SimSun" w:cs="SimSun"/>
+                <w:b/>
+                <w:bCs/>
+                <w:sz w:val="24"/>
+                <w:szCs w:val="24"/>
+                <w:lang w:bidi="ar"/>
+              </w:rPr>
+              <w:t xml:space="preserve"> </w:t>
+            </w:r>
+            <w:proofErr w:type="spellStart"/>
+            <w:proofErr w:type="gramStart"/>
+            <w:r>
+              <w:rPr>
+                <w:rFonts w:ascii="SimSun" w:eastAsia="SimSun" w:hAnsi="SimSun" w:cs="SimSun"/>
+                <w:b/>
+                <w:bCs/>
+                <w:sz w:val="24"/>
+                <w:szCs w:val="24"/>
+                <w:lang w:bidi="ar"/>
+              </w:rPr>
+              <w:t>Singha</w:t>
+            </w:r>
+            <w:proofErr w:type="spellEnd"/>
+            <w:r>
+              <w:rPr>
+                <w:rFonts w:ascii="SimSun" w:eastAsia="SimSun" w:hAnsi="SimSun" w:cs="SimSun"/>
+                <w:b/>
+                <w:bCs/>
+                <w:sz w:val="24"/>
+                <w:szCs w:val="24"/>
+                <w:lang w:bidi="ar"/>
+              </w:rPr>
+              <w:t xml:space="preserve"> .</w:t>
+            </w:r>
+            <w:proofErr w:type="gramEnd"/>
+          </w:p>
+        </w:tc>
+        <w:tc>
+          <w:tcPr>
+            <w:tcW w:w="2045" w:type="dxa"/>
+            <w:shd w:val="clear" w:color="auto" w:fill="auto"/>
+            <w:vAlign w:val="center"/>
+          </w:tcPr>
+          <w:p>
+            <w:pPr>
+              <w:widowControl w:val="0"/>
+              <w:jc w:val="both"/>
+              <w:rPr>
+                <w:rFonts w:ascii="SimSun" w:eastAsia="SimSun" w:hAnsi="SimSun" w:cs="SimSun"/>
+                <w:b/>
+                <w:bCs/>
+                <w:sz w:val="24"/>
+                <w:szCs w:val="24"/>
+                <w:lang w:bidi="ar"/>
+              </w:rPr>
+            </w:pPr>
+            <w:proofErr w:type="spellStart"/>
+            <w:r>
+              <w:rPr>
+                <w:rFonts w:ascii="SimSun" w:eastAsia="SimSun" w:hAnsi="SimSun" w:cs="SimSun"/>
+                <w:b/>
+                <w:bCs/>
+                <w:sz w:val="24"/>
+                <w:szCs w:val="24"/>
+                <w:lang w:bidi="ar"/>
+              </w:rPr>
+              <w:t>Cachar</w:t>
+            </w:r>
+            <w:proofErr w:type="spellEnd"/>
+            <w:r>
+              <w:rPr>
+                <w:rFonts w:ascii="SimSun" w:eastAsia="SimSun" w:hAnsi="SimSun" w:cs="SimSun"/>
+                <w:b/>
+                <w:bCs/>
+                <w:sz w:val="24"/>
+                <w:szCs w:val="24"/>
+                <w:lang w:bidi="ar"/>
+              </w:rPr>
+              <w:t xml:space="preserve"> , </w:t>
+            </w:r>
+            <w:proofErr w:type="spellStart"/>
+            <w:r>
+              <w:rPr>
+                <w:rFonts w:ascii="SimSun" w:eastAsia="SimSun" w:hAnsi="SimSun" w:cs="SimSun"/>
+                <w:b/>
+                <w:bCs/>
+                <w:sz w:val="24"/>
+                <w:szCs w:val="24"/>
+                <w:lang w:bidi="ar"/>
+              </w:rPr>
+              <w:t>Silchar</w:t>
+            </w:r>
+            <w:proofErr w:type="spellEnd"/>
+          </w:p>
+        </w:tc>
+        <w:tc>
+          <w:tcPr>
+            <w:tcW w:w="1342" w:type="dxa"/>
+            <w:shd w:val="clear" w:color="auto" w:fill="auto"/>
+            <w:vAlign w:val="center"/>
+          </w:tcPr>
+          <w:p>
+            <w:pPr>
+              <w:widowControl w:val="0"/>
+              <w:jc w:val="both"/>
+              <w:rPr>
+                <w:rFonts w:ascii="SimSun" w:eastAsia="SimSun" w:hAnsi="SimSun" w:cs="SimSun"/>
+                <w:b/>
+                <w:bCs/>
+                <w:sz w:val="24"/>
+                <w:szCs w:val="24"/>
+                <w:lang w:bidi="ar"/>
+              </w:rPr>
+            </w:pPr>
+            <w:r>
+              <w:rPr>
+                <w:rFonts w:ascii="SimSun" w:eastAsia="SimSun" w:hAnsi="SimSun" w:cs="SimSun"/>
+                <w:b/>
+                <w:bCs/>
+                <w:sz w:val="24"/>
+                <w:szCs w:val="24"/>
+                <w:lang w:bidi="ar"/>
+              </w:rPr>
+              <w:t>₹1,000/-</w:t>
+            </w:r>
+          </w:p>
+        </w:tc>
+        <w:tc>
+          <w:tcPr>
+            <w:tcW w:w="1524" w:type="dxa"/>
+            <w:shd w:val="clear" w:color="auto" w:fill="auto"/>
+            <w:vAlign w:val="center"/>
+          </w:tcPr>
+          <w:p>
+            <w:pPr>
+              <w:widowControl w:val="0"/>
+              <w:jc w:val="both"/>
+              <w:rPr>
+                <w:rFonts w:ascii="SimSun" w:eastAsia="SimSun" w:hAnsi="SimSun" w:cs="SimSun"/>
+                <w:b/>
+                <w:bCs/>
+                <w:sz w:val="24"/>
+                <w:szCs w:val="24"/>
+                <w:lang w:bidi="ar"/>
+              </w:rPr>
+            </w:pPr>
+            <w:r>
+              <w:rPr>
+                <w:rFonts w:ascii="SimSun" w:eastAsia="SimSun" w:hAnsi="SimSun" w:cs="SimSun"/>
+                <w:b/>
+                <w:bCs/>
+                <w:sz w:val="24"/>
+                <w:szCs w:val="24"/>
+                <w:lang w:bidi="ar"/>
+              </w:rPr>
+              <w:t>10 Sept.2026</w:t>
+            </w:r>
+          </w:p>
+        </w:tc>
+        <w:tc>
+          <w:tcPr>
+            <w:tcW w:w="1207" w:type="dxa"/>
+            <w:shd w:val="clear" w:color="auto" w:fill="auto"/>
+            <w:vAlign w:val="center"/>
+          </w:tcPr>
+          <w:p>
+            <w:pPr>
+              <w:widowControl w:val="0"/>
+              <w:jc w:val="both"/>
+              <w:rPr>
+                <w:rFonts w:ascii="SimSun" w:eastAsia="SimSun" w:hAnsi="SimSun" w:cs="SimSun"/>
+                <w:b/>
+                <w:bCs/>
+                <w:sz w:val="24"/>
+                <w:szCs w:val="24"/>
+                <w:lang w:bidi="ar"/>
+              </w:rPr>
+            </w:pPr>
+            <w:r>
+              <w:rPr>
+                <w:rFonts w:ascii="SimSun" w:eastAsia="SimSun" w:hAnsi="SimSun" w:cs="SimSun"/>
+                <w:b/>
+                <w:bCs/>
+                <w:sz w:val="24"/>
+                <w:szCs w:val="24"/>
+                <w:lang w:bidi="ar"/>
+              </w:rPr>
+              <w:t>013</w:t>
+            </w:r>
+          </w:p>
+        </w:tc>
+      </w:tr>
+      <w:tr>
+        <w:tc>
+          <w:tcPr>
+            <w:tcW w:w="656" w:type="dxa"/>
+            <w:shd w:val="clear" w:color="auto" w:fill="auto"/>
+            <w:vAlign w:val="center"/>
+          </w:tcPr>
+          <w:p>
+            <w:pPr>
+              <w:widowControl w:val="0"/>
+              <w:jc w:val="both"/>
+              <w:rPr>
+                <w:rFonts w:ascii="SimSun" w:eastAsia="SimSun" w:hAnsi="SimSun" w:cs="SimSun"/>
+                <w:b/>
+                <w:bCs/>
+                <w:sz w:val="24"/>
+                <w:szCs w:val="24"/>
+                <w:lang w:bidi="ar"/>
+              </w:rPr>
+            </w:pPr>
+            <w:r>
+              <w:rPr>
+                <w:rFonts w:ascii="SimSun" w:eastAsia="SimSun" w:hAnsi="SimSun" w:cs="SimSun"/>
+                <w:b/>
+                <w:bCs/>
+                <w:sz w:val="24"/>
+                <w:szCs w:val="24"/>
+                <w:lang w:bidi="ar"/>
+              </w:rPr>
+              <w:t>12</w:t>
+            </w:r>
+          </w:p>
+        </w:tc>
+        <w:tc>
+          <w:tcPr>
+            <w:tcW w:w="2447" w:type="dxa"/>
+            <w:shd w:val="clear" w:color="auto" w:fill="auto"/>
+            <w:vAlign w:val="center"/>
+          </w:tcPr>
+          <w:p>
+            <w:pPr>
+              <w:widowControl w:val="0"/>
+              <w:jc w:val="both"/>
+              <w:rPr>
+                <w:rFonts w:ascii="SimSun" w:eastAsia="SimSun" w:hAnsi="SimSun" w:cs="SimSun"/>
+                <w:b/>
+                <w:bCs/>
+                <w:sz w:val="24"/>
+                <w:szCs w:val="24"/>
+                <w:lang w:bidi="ar"/>
+              </w:rPr>
+            </w:pPr>
+            <w:r>
+              <w:rPr>
+                <w:rFonts w:ascii="SimSun" w:eastAsia="SimSun" w:hAnsi="SimSun" w:cs="SimSun"/>
+                <w:b/>
+                <w:bCs/>
+                <w:sz w:val="24"/>
+                <w:szCs w:val="24"/>
+                <w:lang w:bidi="ar"/>
+              </w:rPr>
+              <w:t>K M</w:t>
+            </w:r>
+            <w:r>
+              <w:rPr>
+                <w:rFonts w:ascii="SimSun" w:eastAsia="SimSun" w:hAnsi="SimSun" w:cs="SimSun"/>
+                <w:b/>
+                <w:bCs/>
+                <w:sz w:val="24"/>
+                <w:szCs w:val="24"/>
+                <w:lang w:bidi="ar"/>
+              </w:rPr>
+              <w:t xml:space="preserve"> </w:t>
+            </w:r>
+            <w:proofErr w:type="spellStart"/>
+            <w:r>
+              <w:rPr>
+                <w:rFonts w:ascii="SimSun" w:eastAsia="SimSun" w:hAnsi="SimSun" w:cs="SimSun"/>
+                <w:b/>
+                <w:bCs/>
+                <w:sz w:val="24"/>
+                <w:szCs w:val="24"/>
+                <w:lang w:bidi="ar"/>
+              </w:rPr>
+              <w:t>Gopal</w:t>
+            </w:r>
+            <w:proofErr w:type="spellEnd"/>
+            <w:r>
+              <w:rPr>
+                <w:rFonts w:ascii="SimSun" w:eastAsia="SimSun" w:hAnsi="SimSun" w:cs="SimSun"/>
+                <w:b/>
+                <w:bCs/>
+                <w:sz w:val="24"/>
+                <w:szCs w:val="24"/>
+                <w:lang w:bidi="ar"/>
+              </w:rPr>
+              <w:t xml:space="preserve"> Sana</w:t>
+            </w:r>
+            <w:r>
+              <w:rPr>
+                <w:rFonts w:ascii="SimSun" w:eastAsia="SimSun" w:hAnsi="SimSun" w:cs="SimSun"/>
+                <w:b/>
+                <w:bCs/>
+                <w:sz w:val="24"/>
+                <w:szCs w:val="24"/>
+                <w:lang w:bidi="ar"/>
+              </w:rPr>
+              <w:t xml:space="preserve"> Raj Kumar</w:t>
+            </w:r>
+            <w:r>
+              <w:rPr>
+                <w:rFonts w:ascii="SimSun" w:eastAsia="SimSun" w:hAnsi="SimSun" w:cs="SimSun"/>
+                <w:b/>
+                <w:bCs/>
+                <w:sz w:val="24"/>
+                <w:szCs w:val="24"/>
+                <w:lang w:bidi="ar"/>
+              </w:rPr>
+              <w:t>.</w:t>
+            </w:r>
+          </w:p>
+        </w:tc>
+        <w:tc>
+          <w:tcPr>
+            <w:tcW w:w="2045" w:type="dxa"/>
+            <w:shd w:val="clear" w:color="auto" w:fill="auto"/>
+            <w:vAlign w:val="center"/>
+          </w:tcPr>
+          <w:p>
+            <w:pPr>
+              <w:widowControl w:val="0"/>
+              <w:jc w:val="both"/>
+              <w:rPr>
+                <w:rFonts w:ascii="SimSun" w:eastAsia="SimSun" w:hAnsi="SimSun" w:cs="SimSun"/>
+                <w:b/>
+                <w:bCs/>
+                <w:sz w:val="24"/>
+                <w:szCs w:val="24"/>
+                <w:lang w:bidi="ar"/>
+              </w:rPr>
+            </w:pPr>
+            <w:proofErr w:type="spellStart"/>
+            <w:r>
+              <w:rPr>
+                <w:rFonts w:ascii="SimSun" w:eastAsia="SimSun" w:hAnsi="SimSun" w:cs="SimSun"/>
+                <w:b/>
+                <w:bCs/>
+                <w:sz w:val="24"/>
+                <w:szCs w:val="24"/>
+                <w:lang w:bidi="ar"/>
+              </w:rPr>
+              <w:t>Cachar</w:t>
+            </w:r>
+            <w:proofErr w:type="spellEnd"/>
+            <w:r>
+              <w:rPr>
+                <w:rFonts w:ascii="SimSun" w:eastAsia="SimSun" w:hAnsi="SimSun" w:cs="SimSun"/>
+                <w:b/>
+                <w:bCs/>
+                <w:sz w:val="24"/>
+                <w:szCs w:val="24"/>
+                <w:lang w:bidi="ar"/>
+              </w:rPr>
+              <w:t xml:space="preserve"> , </w:t>
+            </w:r>
+            <w:proofErr w:type="spellStart"/>
+            <w:r>
+              <w:rPr>
+                <w:rFonts w:ascii="SimSun" w:eastAsia="SimSun" w:hAnsi="SimSun" w:cs="SimSun"/>
+                <w:b/>
+                <w:bCs/>
+                <w:sz w:val="24"/>
+                <w:szCs w:val="24"/>
+                <w:lang w:bidi="ar"/>
+              </w:rPr>
+              <w:t>Silchar</w:t>
+            </w:r>
+            <w:proofErr w:type="spellEnd"/>
+          </w:p>
+        </w:tc>
+        <w:tc>
+          <w:tcPr>
+            <w:tcW w:w="1342" w:type="dxa"/>
+            <w:shd w:val="clear" w:color="auto" w:fill="auto"/>
+            <w:vAlign w:val="center"/>
+          </w:tcPr>
+          <w:p>
+            <w:pPr>
+              <w:widowControl w:val="0"/>
+              <w:jc w:val="both"/>
+              <w:rPr>
+                <w:rFonts w:ascii="SimSun" w:eastAsia="SimSun" w:hAnsi="SimSun" w:cs="SimSun"/>
+                <w:b/>
+                <w:bCs/>
+                <w:sz w:val="24"/>
+                <w:szCs w:val="24"/>
+                <w:lang w:bidi="ar"/>
+              </w:rPr>
+            </w:pPr>
+            <w:r>
+              <w:rPr>
+                <w:rFonts w:ascii="Times New Roman" w:eastAsia="SimSun" w:hAnsi="Times New Roman"/>
+                <w:b/>
+                <w:bCs/>
+                <w:sz w:val="24"/>
+                <w:szCs w:val="24"/>
+                <w:lang w:bidi="ar"/>
+              </w:rPr>
+              <w:t>₹</w:t>
+            </w:r>
+            <w:r>
+              <w:rPr>
+                <w:rFonts w:ascii="Times New Roman" w:eastAsia="SimSun" w:hAnsi="Times New Roman"/>
+                <w:b/>
+                <w:bCs/>
+                <w:sz w:val="24"/>
+                <w:szCs w:val="24"/>
+                <w:lang w:bidi="ar"/>
+              </w:rPr>
+              <w:t xml:space="preserve"> </w:t>
+            </w:r>
+            <w:r>
+              <w:rPr>
+                <w:rFonts w:ascii="SimSun" w:eastAsia="SimSun" w:hAnsi="SimSun" w:cs="SimSun"/>
+                <w:b/>
+                <w:bCs/>
+                <w:sz w:val="24"/>
+                <w:szCs w:val="24"/>
+                <w:lang w:bidi="ar"/>
+              </w:rPr>
+              <w:t>7</w:t>
+            </w:r>
+            <w:r>
+              <w:rPr>
+                <w:rFonts w:ascii="SimSun" w:eastAsia="SimSun" w:hAnsi="SimSun" w:cs="SimSun"/>
+                <w:b/>
+                <w:bCs/>
+                <w:sz w:val="24"/>
+                <w:szCs w:val="24"/>
+                <w:lang w:bidi="ar"/>
+              </w:rPr>
+              <w:t>,000/-</w:t>
+            </w:r>
+          </w:p>
+        </w:tc>
+        <w:tc>
+          <w:tcPr>
+            <w:tcW w:w="1524" w:type="dxa"/>
+            <w:shd w:val="clear" w:color="auto" w:fill="auto"/>
+            <w:vAlign w:val="center"/>
+          </w:tcPr>
+          <w:p>
+            <w:pPr>
+              <w:widowControl w:val="0"/>
+              <w:jc w:val="both"/>
+              <w:rPr>
+                <w:rFonts w:ascii="SimSun" w:eastAsia="SimSun" w:hAnsi="SimSun" w:cs="SimSun"/>
+                <w:b/>
+                <w:bCs/>
+                <w:sz w:val="24"/>
+                <w:szCs w:val="24"/>
+                <w:lang w:bidi="ar"/>
+              </w:rPr>
+            </w:pPr>
+            <w:r>
+              <w:rPr>
+                <w:rFonts w:ascii="SimSun" w:eastAsia="SimSun" w:hAnsi="SimSun" w:cs="SimSun"/>
+                <w:b/>
+                <w:bCs/>
+                <w:sz w:val="24"/>
+                <w:szCs w:val="24"/>
+                <w:lang w:bidi="ar"/>
+              </w:rPr>
+              <w:t>10 Sept.2026</w:t>
+            </w:r>
+          </w:p>
+        </w:tc>
+        <w:tc>
+          <w:tcPr>
+            <w:tcW w:w="1207" w:type="dxa"/>
+            <w:shd w:val="clear" w:color="auto" w:fill="auto"/>
+            <w:vAlign w:val="center"/>
+          </w:tcPr>
+          <w:p>
+            <w:pPr>
+              <w:widowControl w:val="0"/>
+              <w:jc w:val="both"/>
+              <w:rPr>
+                <w:rFonts w:ascii="SimSun" w:eastAsia="SimSun" w:hAnsi="SimSun" w:cs="SimSun"/>
+                <w:b/>
+                <w:bCs/>
+                <w:sz w:val="24"/>
+                <w:szCs w:val="24"/>
+                <w:lang w:bidi="ar"/>
+              </w:rPr>
+            </w:pPr>
+            <w:r>
+              <w:rPr>
+                <w:rFonts w:ascii="SimSun" w:eastAsia="SimSun" w:hAnsi="SimSun" w:cs="SimSun"/>
+                <w:b/>
+                <w:bCs/>
+                <w:sz w:val="24"/>
+                <w:szCs w:val="24"/>
+                <w:lang w:bidi="ar"/>
+              </w:rPr>
+              <w:t>014</w:t>
+            </w:r>
+          </w:p>
+        </w:tc>
+      </w:tr>
+      <w:tr>
+        <w:tc>
+          <w:tcPr>
+            <w:tcW w:w="656" w:type="dxa"/>
+            <w:shd w:val="clear" w:color="auto" w:fill="auto"/>
+            <w:vAlign w:val="center"/>
+          </w:tcPr>
+          <w:p>
+            <w:pPr>
+              <w:widowControl w:val="0"/>
+              <w:jc w:val="both"/>
+              <w:rPr>
+                <w:rFonts w:ascii="SimSun" w:eastAsia="SimSun" w:hAnsi="SimSun" w:cs="SimSun"/>
+                <w:b/>
+                <w:bCs/>
+                <w:sz w:val="24"/>
+                <w:szCs w:val="24"/>
+                <w:lang w:bidi="ar"/>
+              </w:rPr>
+            </w:pPr>
+            <w:r>
+              <w:rPr>
+                <w:rFonts w:ascii="SimSun" w:eastAsia="SimSun" w:hAnsi="SimSun" w:cs="SimSun"/>
+                <w:b/>
+                <w:bCs/>
+                <w:sz w:val="24"/>
+                <w:szCs w:val="24"/>
+                <w:lang w:bidi="ar"/>
+              </w:rPr>
+              <w:t>13</w:t>
+            </w:r>
+          </w:p>
+        </w:tc>
+        <w:tc>
+          <w:tcPr>
+            <w:tcW w:w="2447" w:type="dxa"/>
+            <w:shd w:val="clear" w:color="auto" w:fill="auto"/>
+            <w:vAlign w:val="center"/>
+          </w:tcPr>
+          <w:p>
+            <w:pPr>
+              <w:widowControl w:val="0"/>
+              <w:jc w:val="both"/>
+              <w:rPr>
+                <w:rFonts w:ascii="SimSun" w:eastAsia="SimSun" w:hAnsi="SimSun" w:cs="SimSun"/>
+                <w:b/>
+                <w:bCs/>
+                <w:sz w:val="24"/>
+                <w:szCs w:val="24"/>
+                <w:lang w:bidi="ar"/>
+              </w:rPr>
+            </w:pPr>
+            <w:r>
+              <w:rPr>
+                <w:rFonts w:ascii="SimSun" w:eastAsia="SimSun" w:hAnsi="SimSun" w:cs="SimSun"/>
+                <w:b/>
+                <w:bCs/>
+                <w:sz w:val="24"/>
+                <w:szCs w:val="24"/>
+                <w:lang w:bidi="ar"/>
+              </w:rPr>
+              <w:t xml:space="preserve">Sri Dina </w:t>
+            </w:r>
+            <w:proofErr w:type="spellStart"/>
+            <w:r>
+              <w:rPr>
+                <w:rFonts w:ascii="SimSun" w:eastAsia="SimSun" w:hAnsi="SimSun" w:cs="SimSun"/>
+                <w:b/>
+                <w:bCs/>
+                <w:sz w:val="24"/>
+                <w:szCs w:val="24"/>
+                <w:lang w:bidi="ar"/>
+              </w:rPr>
+              <w:t>Bandhu</w:t>
+            </w:r>
+            <w:proofErr w:type="spellEnd"/>
+            <w:r>
+              <w:rPr>
+                <w:rFonts w:ascii="SimSun" w:eastAsia="SimSun" w:hAnsi="SimSun" w:cs="SimSun"/>
+                <w:b/>
+                <w:bCs/>
+                <w:sz w:val="24"/>
+                <w:szCs w:val="24"/>
+                <w:lang w:bidi="ar"/>
+              </w:rPr>
+              <w:t xml:space="preserve"> Das</w:t>
+            </w:r>
+          </w:p>
+        </w:tc>
+        <w:tc>
+          <w:tcPr>
+            <w:tcW w:w="2045" w:type="dxa"/>
+            <w:shd w:val="clear" w:color="auto" w:fill="auto"/>
+            <w:vAlign w:val="center"/>
+          </w:tcPr>
+          <w:p>
+            <w:pPr>
+              <w:widowControl w:val="0"/>
+              <w:jc w:val="both"/>
+              <w:rPr>
+                <w:rFonts w:ascii="SimSun" w:eastAsia="SimSun" w:hAnsi="SimSun" w:cs="SimSun"/>
+                <w:b/>
+                <w:bCs/>
+                <w:sz w:val="24"/>
+                <w:szCs w:val="24"/>
+                <w:lang w:bidi="ar"/>
+              </w:rPr>
+            </w:pPr>
+            <w:proofErr w:type="spellStart"/>
+            <w:r>
+              <w:rPr>
+                <w:rFonts w:ascii="SimSun" w:eastAsia="SimSun" w:hAnsi="SimSun" w:cs="SimSun"/>
+                <w:b/>
+                <w:bCs/>
+                <w:sz w:val="24"/>
+                <w:szCs w:val="24"/>
+                <w:lang w:bidi="ar"/>
+              </w:rPr>
+              <w:t>Goalpara</w:t>
+            </w:r>
+            <w:proofErr w:type="spellEnd"/>
+            <w:r>
+              <w:rPr>
+                <w:rFonts w:ascii="SimSun" w:eastAsia="SimSun" w:hAnsi="SimSun" w:cs="SimSun"/>
+                <w:b/>
+                <w:bCs/>
+                <w:sz w:val="24"/>
+                <w:szCs w:val="24"/>
+                <w:lang w:bidi="ar"/>
+              </w:rPr>
+              <w:t xml:space="preserve"> </w:t>
+            </w:r>
+          </w:p>
+        </w:tc>
+        <w:tc>
+          <w:tcPr>
+            <w:tcW w:w="1342" w:type="dxa"/>
+            <w:shd w:val="clear" w:color="auto" w:fill="auto"/>
+            <w:vAlign w:val="center"/>
+          </w:tcPr>
+          <w:p>
+            <w:pPr>
+              <w:widowControl w:val="0"/>
+              <w:jc w:val="both"/>
+              <w:rPr>
+                <w:rFonts w:ascii="Times New Roman" w:eastAsia="SimSun" w:hAnsi="Times New Roman"/>
+                <w:b/>
+                <w:bCs/>
+                <w:sz w:val="24"/>
+                <w:szCs w:val="24"/>
+                <w:lang w:bidi="ar"/>
+              </w:rPr>
+            </w:pPr>
+            <w:r>
+              <w:rPr>
+                <w:rFonts w:ascii="Times New Roman" w:eastAsia="SimSun" w:hAnsi="Times New Roman"/>
+                <w:b/>
+                <w:bCs/>
+                <w:sz w:val="24"/>
+                <w:szCs w:val="24"/>
+                <w:lang w:bidi="ar"/>
+              </w:rPr>
+              <w:t>₹</w:t>
+            </w:r>
+            <w:r>
+              <w:rPr>
+                <w:rFonts w:ascii="Times New Roman" w:eastAsia="SimSun" w:hAnsi="Times New Roman"/>
+                <w:b/>
+                <w:bCs/>
+                <w:sz w:val="24"/>
+                <w:szCs w:val="24"/>
+                <w:lang w:bidi="ar"/>
+              </w:rPr>
+              <w:t xml:space="preserve"> </w:t>
+            </w:r>
+            <w:r>
+              <w:rPr>
+                <w:rFonts w:ascii="SimSun" w:eastAsia="SimSun" w:hAnsi="SimSun" w:cs="SimSun"/>
+                <w:b/>
+                <w:bCs/>
+                <w:sz w:val="24"/>
+                <w:szCs w:val="24"/>
+                <w:lang w:bidi="ar"/>
+              </w:rPr>
+              <w:t>10</w:t>
+            </w:r>
+            <w:r>
+              <w:rPr>
+                <w:rFonts w:ascii="SimSun" w:eastAsia="SimSun" w:hAnsi="SimSun" w:cs="SimSun"/>
+                <w:b/>
+                <w:bCs/>
+                <w:sz w:val="24"/>
+                <w:szCs w:val="24"/>
+                <w:lang w:bidi="ar"/>
+              </w:rPr>
+              <w:t>,000/-</w:t>
+            </w:r>
+          </w:p>
+        </w:tc>
+        <w:tc>
+          <w:tcPr>
+            <w:tcW w:w="1524" w:type="dxa"/>
+            <w:shd w:val="clear" w:color="auto" w:fill="auto"/>
+            <w:vAlign w:val="center"/>
+          </w:tcPr>
+          <w:p>
+            <w:pPr>
+              <w:widowControl w:val="0"/>
+              <w:jc w:val="both"/>
+              <w:rPr>
+                <w:rFonts w:ascii="SimSun" w:eastAsia="SimSun" w:hAnsi="SimSun" w:cs="SimSun"/>
+                <w:b/>
+                <w:bCs/>
+                <w:sz w:val="24"/>
+                <w:szCs w:val="24"/>
+                <w:lang w:bidi="ar"/>
+              </w:rPr>
+            </w:pPr>
+            <w:r>
+              <w:rPr>
+                <w:rFonts w:ascii="SimSun" w:eastAsia="SimSun" w:hAnsi="SimSun" w:cs="SimSun"/>
+                <w:b/>
+                <w:bCs/>
+                <w:sz w:val="24"/>
+                <w:szCs w:val="24"/>
+                <w:lang w:bidi="ar"/>
+              </w:rPr>
+              <w:t>12 Sept.2026</w:t>
+            </w:r>
+          </w:p>
+        </w:tc>
+        <w:tc>
+          <w:tcPr>
+            <w:tcW w:w="1207" w:type="dxa"/>
+            <w:shd w:val="clear" w:color="auto" w:fill="auto"/>
+            <w:vAlign w:val="center"/>
+          </w:tcPr>
+          <w:p>
+            <w:pPr>
+              <w:widowControl w:val="0"/>
+              <w:jc w:val="both"/>
+              <w:rPr>
+                <w:rFonts w:ascii="SimSun" w:eastAsia="SimSun" w:hAnsi="SimSun" w:cs="SimSun"/>
+                <w:b/>
+                <w:bCs/>
+                <w:sz w:val="24"/>
+                <w:szCs w:val="24"/>
+                <w:lang w:bidi="ar"/>
+              </w:rPr>
+            </w:pPr>
+            <w:r>
+              <w:rPr>
+                <w:rFonts w:ascii="SimSun" w:eastAsia="SimSun" w:hAnsi="SimSun" w:cs="SimSun"/>
+                <w:b/>
+                <w:bCs/>
+                <w:sz w:val="24"/>
+                <w:szCs w:val="24"/>
+                <w:lang w:bidi="ar"/>
+              </w:rPr>
+              <w:t>007</w:t>
             </w:r>
             <w:bookmarkStart w:id="0" w:name="_GoBack"/>
             <w:bookmarkEnd w:id="0"/>
@@ -3218,6 +4075,34 @@
       <w:bCs/>
     </w:rPr>
   </w:style>
+  <w:style w:type="paragraph" w:styleId="BalloonText">
+    <w:name w:val="Balloon Text"/>
+    <w:basedOn w:val="Normal"/>
+    <w:link w:val="BalloonTextChar"/>
+    <w:uiPriority w:val="99"/>
+    <w:semiHidden/>
+    <w:unhideWhenUsed/>
+    <w:rsid w:val="00400DDD"/>
+    <w:rPr>
+      <w:rFonts w:ascii="Segoe UI" w:hAnsi="Segoe UI" w:cs="Segoe UI"/>
+      <w:sz w:val="18"/>
+      <w:szCs w:val="18"/>
+    </w:rPr>
+  </w:style>
+  <w:style w:type="character" w:customStyle="1" w:styleId="BalloonTextChar">
+    <w:name w:val="Balloon Text Char"/>
+    <w:basedOn w:val="DefaultParagraphFont"/>
+    <w:link w:val="BalloonText"/>
+    <w:uiPriority w:val="99"/>
+    <w:semiHidden/>
+    <w:rsid w:val="00400DDD"/>
+    <w:rPr>
+      <w:rFonts w:ascii="Segoe UI" w:eastAsia="等线" w:hAnsi="Segoe UI" w:cs="Segoe UI"/>
+      <w:sz w:val="18"/>
+      <w:szCs w:val="18"/>
+      <w:lang w:val="en-US" w:eastAsia="zh-CN"/>
+    </w:rPr>
+  </w:style>
 </w:styles>
 </file>
 

</xml_diff>